<commit_message>
implementação de testes unitários com JUnit 5 para AgendamentoService
</commit_message>
<xml_diff>
--- a/docs/02-relatorio-refatoracao.docx
+++ b/docs/02-relatorio-refatoracao.docx
@@ -95,49 +95,17 @@
     </w:p>
     <w:p>
       <w:r>
-        <w:t xml:space="preserve">Durante o desenvolvimento, a estrutura do sistema foi organizada em camadas, separando as responsabilidades entre os pacotes model, </w:t>
-      </w:r>
-      <w:proofErr w:type="spellStart"/>
-      <w:r>
-        <w:t>repository</w:t>
-      </w:r>
-      <w:proofErr w:type="spellEnd"/>
-      <w:r>
-        <w:t xml:space="preserve">, </w:t>
-      </w:r>
-      <w:proofErr w:type="spellStart"/>
-      <w:r>
-        <w:t>service</w:t>
-      </w:r>
-      <w:proofErr w:type="spellEnd"/>
-      <w:r>
-        <w:t xml:space="preserve"> e ui. Essa organização teve como objetivo facilitar a manutenção, a evolução e a substituição de componentes do sistema sem comprometer as regras de negócio.</w:t>
-      </w:r>
-    </w:p>
-    <w:p>
-      <w:r>
-        <w:t xml:space="preserve">Os princípios SOLID foram utilizados como referência para a definição da arquitetura e das responsabilidades das classes. O princípio da Responsabilidade Única (SRP) foi aplicado por meio da separação das responsabilidades de domínio, persistência, regras de negócio e apresentação. O princípio Aberto/Fechado (OCP) foi contemplado principalmente pela utilização do padrão </w:t>
-      </w:r>
-      <w:proofErr w:type="spellStart"/>
-      <w:r>
-        <w:t>Strategy</w:t>
-      </w:r>
-      <w:proofErr w:type="spellEnd"/>
-      <w:r>
-        <w:t xml:space="preserve"> para as políticas de desconto. Os demais princípios SOLID também foram considerados na definição das interfaces, dependências e implementações do sistema.</w:t>
-      </w:r>
-    </w:p>
-    <w:p>
-      <w:r>
-        <w:t xml:space="preserve">Além dos princípios SOLID, foi utilizado o padrão de projeto </w:t>
-      </w:r>
-      <w:proofErr w:type="spellStart"/>
-      <w:r>
-        <w:t>Strategy</w:t>
-      </w:r>
-      <w:proofErr w:type="spellEnd"/>
-      <w:r>
-        <w:t xml:space="preserve"> para permitir que diferentes políticas de desconto possam ser implementadas de forma independente. Também foram utilizadas interfaces para desacoplar as regras de negócio das implementações de persistência e notificação.</w:t>
+        <w:t>Durante o desenvolvimento, a estrutura do sistema foi organizada em camadas, separando as responsabilidades entre os pacotes model, repository, service e ui. Essa organização teve como objetivo facilitar a manutenção, a evolução e a substituição de componentes do sistema sem comprometer as regras de negócio.</w:t>
+      </w:r>
+    </w:p>
+    <w:p>
+      <w:r>
+        <w:t>Os princípios SOLID foram utilizados como referência para a definição da arquitetura e das responsabilidades das classes. O princípio da Responsabilidade Única (SRP) foi aplicado por meio da separação das responsabilidades de domínio, persistência, regras de negócio e apresentação. O princípio Aberto/Fechado (OCP) foi contemplado principalmente pela utilização do padrão Strategy para as políticas de desconto. Os demais princípios SOLID também foram considerados na definição das interfaces, dependências e implementações do sistema.</w:t>
+      </w:r>
+    </w:p>
+    <w:p>
+      <w:r>
+        <w:t>Além dos princípios SOLID, foi utilizado o padrão de projeto Strategy para permitir que diferentes políticas de desconto possam ser implementadas de forma independente. Também foram utilizadas interfaces para desacoplar as regras de negócio das implementações de persistência e notificação.</w:t>
       </w:r>
     </w:p>
     <w:p>
@@ -1830,23 +1798,7 @@
         <w:spacing w:after="120"/>
       </w:pPr>
       <w:r>
-        <w:t xml:space="preserve">O projeto foi </w:t>
-      </w:r>
-      <w:proofErr w:type="spellStart"/>
-      <w:r>
-        <w:t>versionado</w:t>
-      </w:r>
-      <w:proofErr w:type="spellEnd"/>
-      <w:r>
-        <w:t xml:space="preserve"> utilizando </w:t>
-      </w:r>
-      <w:proofErr w:type="spellStart"/>
-      <w:r>
-        <w:t>Git</w:t>
-      </w:r>
-      <w:proofErr w:type="spellEnd"/>
-      <w:r>
-        <w:t xml:space="preserve"> e publicado em um repositório no GitHub. O repositório contém o código-fonte completo do sistema desenvolvido em Java, incluindo a estrutura em camadas, as entidades de domínio, os repositórios, os serviços, as políticas de desconto, a interface gráfica Swing e os testes automatizados.</w:t>
+        <w:t>O projeto foi versionado utilizando Git e publicado em um repositório no GitHub. O repositório contém o código-fonte completo do sistema desenvolvido em Java, incluindo a estrutura em camadas, as entidades de domínio, os repositórios, os serviços, as políticas de desconto, a interface gráfica Swing e os testes automatizados.</w:t>
       </w:r>
     </w:p>
     <w:p>
@@ -1854,15 +1806,7 @@
         <w:spacing w:after="120"/>
       </w:pPr>
       <w:r>
-        <w:t xml:space="preserve">Como o sistema foi desenvolvido do zero já utilizando os princípios SOLID e o padrão </w:t>
-      </w:r>
-      <w:proofErr w:type="spellStart"/>
-      <w:r>
-        <w:t>Strategy</w:t>
-      </w:r>
-      <w:proofErr w:type="spellEnd"/>
-      <w:r>
-        <w:t>, o histórico inicial do repositório contém o estado completo do projeto após sua implementação.</w:t>
+        <w:t>Como o sistema foi desenvolvido do zero já utilizando os princípios SOLID e o padrão Strategy, o histórico inicial do repositório contém o estado completo do projeto após sua implementação.</w:t>
       </w:r>
     </w:p>
     <w:p>
@@ -1878,19 +1822,7 @@
           <w:rPr>
             <w:rStyle w:val="Hyperlink"/>
           </w:rPr>
-          <w:t>https://github.com/Joao0613</w:t>
-        </w:r>
-        <w:r>
-          <w:rPr>
-            <w:rStyle w:val="Hyperlink"/>
-          </w:rPr>
-          <w:t>/</w:t>
-        </w:r>
-        <w:r>
-          <w:rPr>
-            <w:rStyle w:val="Hyperlink"/>
-          </w:rPr>
-          <w:t>agendamento_salao</w:t>
+          <w:t>https://github.com/Joao0613/agendamento_salao</w:t>
         </w:r>
       </w:hyperlink>
     </w:p>
@@ -1947,14 +1879,11 @@
         <w:spacing w:after="120"/>
       </w:pPr>
       <w:r>
-        <w:rPr>
-          <w:noProof/>
-        </w:rPr>
         <w:drawing>
-          <wp:inline distT="0" distB="0" distL="0" distR="0" wp14:anchorId="4539486B" wp14:editId="08218334">
-            <wp:extent cx="5731510" cy="2720975"/>
-            <wp:effectExtent l="0" t="0" r="2540" b="3175"/>
-            <wp:docPr id="2" name="Imagem 2"/>
+          <wp:inline distT="0" distB="0" distL="0" distR="0" wp14:anchorId="645A4074" wp14:editId="089EE795">
+            <wp:extent cx="5731510" cy="2723515"/>
+            <wp:effectExtent l="0" t="0" r="2540" b="635"/>
+            <wp:docPr id="3" name="Imagem 3"/>
             <wp:cNvGraphicFramePr>
               <a:graphicFrameLocks xmlns:a="http://schemas.openxmlformats.org/drawingml/2006/main" noChangeAspect="1"/>
             </wp:cNvGraphicFramePr>
@@ -1974,7 +1903,7 @@
                   <pic:spPr>
                     <a:xfrm>
                       <a:off x="0" y="0"/>
-                      <a:ext cx="5731510" cy="2720975"/>
+                      <a:ext cx="5731510" cy="2723515"/>
                     </a:xfrm>
                     <a:prstGeom prst="rect">
                       <a:avLst/>
@@ -2012,15 +1941,7 @@
         <w:spacing w:after="120"/>
       </w:pPr>
       <w:r>
-        <w:t xml:space="preserve">O princípio da Responsabilidade Única (SRP) foi aplicado na separação das responsabilidades entre as entidades de domínio, serviços, repositórios e interface gráfica. O princípio Aberto/Fechado (OCP) foi demonstrado principalmente por meio do padrão </w:t>
-      </w:r>
-      <w:proofErr w:type="spellStart"/>
-      <w:r>
-        <w:t>Strategy</w:t>
-      </w:r>
-      <w:proofErr w:type="spellEnd"/>
-      <w:r>
-        <w:t xml:space="preserve"> utilizado nas políticas de desconto, permitindo a inclusão de novas regras sem alterações significativas na lógica principal do sistema.</w:t>
+        <w:t>O princípio da Responsabilidade Única (SRP) foi aplicado na separação das responsabilidades entre as entidades de domínio, serviços, repositórios e interface gráfica. O princípio Aberto/Fechado (OCP) foi demonstrado principalmente por meio do padrão Strategy utilizado nas políticas de desconto, permitindo a inclusão de novas regras sem alterações significativas na lógica principal do sistema.</w:t>
       </w:r>
     </w:p>
     <w:p>
@@ -2044,15 +1965,7 @@
         <w:spacing w:after="120"/>
       </w:pPr>
       <w:r>
-        <w:t xml:space="preserve">Portanto, o projeto demonstra a aplicação dos princípios SOLID e do padrão </w:t>
-      </w:r>
-      <w:proofErr w:type="spellStart"/>
-      <w:r>
-        <w:t>Strategy</w:t>
-      </w:r>
-      <w:proofErr w:type="spellEnd"/>
-      <w:r>
-        <w:t xml:space="preserve"> em um sistema desenvolvido do zero, resultando em uma estrutura organizada, modular e preparada para futuras extensões.</w:t>
+        <w:t>Portanto, o projeto demonstra a aplicação dos princípios SOLID e do padrão Strategy em um sistema desenvolvido do zero, resultando em uma estrutura organizada, modular e preparada para futuras extensões.</w:t>
       </w:r>
     </w:p>
     <w:sectPr>
@@ -2641,6 +2554,7 @@
   <w:style w:type="character" w:default="1" w:styleId="Fontepargpadro">
     <w:name w:val="Default Paragraph Font"/>
     <w:uiPriority w:val="1"/>
+    <w:semiHidden/>
     <w:unhideWhenUsed/>
   </w:style>
   <w:style w:type="table" w:default="1" w:styleId="Tabelanormal">

</xml_diff>